<commit_message>
Add document rendering baseline and engine spec
</commit_message>
<xml_diff>
--- a/backend/templates/cover_letter.docx
+++ b/backend/templates/cover_letter.docx
@@ -53,7 +53,7 @@
     </w:p>
     <w:sectPr>
       <w:pgSz w:w="12240" w:h="15840"/>
-      <w:pgMar w:top="1440" w:right="1800" w:bottom="1440" w:left="1800" w:header="720" w:footer="720" w:gutter="0"/>
+      <w:pgMar w:top="1080" w:right="1440" w:bottom="1080" w:left="1440" w:header="720" w:footer="720" w:gutter="0"/>
       <w:cols w:space="720"/>
       <w:docGrid w:linePitch="360"/>
     </w:sectPr>
@@ -424,6 +424,9 @@
     <w:name w:val="Normal"/>
     <w:qFormat/>
     <w:rsid w:val="00FC693F"/>
+    <w:pPr>
+      <w:spacing w:before="0" w:after="0" w:line="240" w:lineRule="auto"/>
+    </w:pPr>
     <w:rPr>
       <w:rFonts w:ascii="Calibri" w:hAnsi="Calibri"/>
       <w:sz w:val="22"/>

</xml_diff>